<commit_message>
Convert selects to datalists; fix checkboxes
Add a script that converts <select> elements in document forms into <input>+<datalist> to allow choosing or typing custom values (static/js/select_to_datalist.js) and include it in the base template. Add onsubmit handlers to doc_form_6, doc_form_7 and doc_form_9 (both admin and applicant variants) to append hidden inputs for unchecked checkboxes (value '☐') so unchecked boxes are submitted and can be processed server-side. Also update Phase2 .docx templates, remove temporary ~$ files, and add an uploaded p2doc_9.docx file.
</commit_message>
<xml_diff>
--- a/HRCP-KKU-Academic/src/main/resources/templates/docx/Phase2/p2doc_4.docx
+++ b/HRCP-KKU-Academic/src/main/resources/templates/docx/Phase2/p2doc_4.docx
@@ -16,7 +16,7 @@
           <w:rFonts w:ascii="TH Sarabun New" w:hAnsi="TH Sarabun New" w:cs="TH Sarabun New"/>
           <w:noProof/>
         </w:rPr>
-        <w:pict w14:anchorId="13D26FD6">
+        <w:pict w14:anchorId="514749DD">
           <v:shapetype id="_x0000_t75" coordsize="21600,21600" o:spt="75" o:preferrelative="t" path="m@4@5l@4@11@9@11@9@5xe" filled="f" stroked="f">
             <v:stroke joinstyle="miter"/>
             <v:formulas>
@@ -1364,7 +1364,7 @@
         <w:pStyle w:val="BodyText"/>
         <w:jc w:val="thaiDistribute"/>
         <w:rPr>
-          <w:rFonts w:ascii="TH Sarabun New" w:hAnsi="TH Sarabun New" w:cs="TH Sarabun New" w:hint="cs"/>
+          <w:rFonts w:ascii="TH Sarabun New" w:hAnsi="TH Sarabun New" w:cs="TH Sarabun New"/>
         </w:rPr>
       </w:pPr>
     </w:p>
@@ -1936,7 +1936,9 @@
   </w:style>
   <w:style w:type="character" w:default="1" w:styleId="DefaultParagraphFont">
     <w:name w:val="Default Paragraph Font"/>
+    <w:uiPriority w:val="1"/>
     <w:semiHidden/>
+    <w:unhideWhenUsed/>
   </w:style>
   <w:style w:type="table" w:default="1" w:styleId="TableNormal">
     <w:name w:val="Normal Table"/>

</xml_diff>

<commit_message>
Support Doc4 placeholders, UI and date autofill
Add special handling for document type 4: remap form field names to template placeholders (preprocessDoc4Placeholders), pass docType into processTemplate, and use a doc4-specific checkbox rendering behavior. Improve XML escaping to preserve line breaks. Add a Thai date auto-fill script (thai_date_autofill.js) and include it in the base template. Update admin/applicant doc_form_4 pages: change checkbox values to ✔, add memo_no field (applicant), make paper/research count fields readonly, and enhance dynamic paper/research row handling (renumbering, add/remove helpers, restore saved rows and values). Update Phase2 docx templates (binary changes) to match these behaviors.
</commit_message>
<xml_diff>
--- a/HRCP-KKU-Academic/src/main/resources/templates/docx/Phase2/p2doc_4.docx
+++ b/HRCP-KKU-Academic/src/main/resources/templates/docx/Phase2/p2doc_4.docx
@@ -4,7 +4,7 @@
   <w:body>
     <w:p>
       <w:pPr>
-        <w:jc w:val="thaiDistribute"/>
+        <w:jc w:val="center"/>
         <w:rPr>
           <w:rFonts w:ascii="TH Sarabun New" w:hAnsi="TH Sarabun New" w:cs="TH Sarabun New"/>
           <w:sz w:val="48"/>
@@ -16,7 +16,7 @@
           <w:rFonts w:ascii="TH Sarabun New" w:hAnsi="TH Sarabun New" w:cs="TH Sarabun New"/>
           <w:noProof/>
         </w:rPr>
-        <w:pict w14:anchorId="514749DD">
+        <w:pict w14:anchorId="14A834E3">
           <v:shapetype id="_x0000_t75" coordsize="21600,21600" o:spt="75" o:preferrelative="t" path="m@4@5l@4@11@9@11@9@5xe" filled="f" stroked="f">
             <v:stroke joinstyle="miter"/>
             <v:formulas>
@@ -36,65 +36,11 @@
             <v:path o:extrusionok="f" gradientshapeok="t" o:connecttype="rect"/>
             <o:lock v:ext="edit" aspectratio="t"/>
           </v:shapetype>
-          <v:shape id="Picture 26" o:spid="_x0000_s1026" type="#_x0000_t75" alt="logo_big" style="position:absolute;left:0;text-align:left;margin-left:-3.2pt;margin-top:-41.5pt;width:40.85pt;height:71.3pt;z-index:1;visibility:visible;mso-wrap-edited:f;mso-width-percent:0;mso-height-percent:0;mso-width-percent:0;mso-height-percent:0">
+          <v:shape id="Picture 26" o:spid="_x0000_s1026" type="#_x0000_t75" alt="logo_big" style="position:absolute;left:0;text-align:left;margin-left:-3pt;margin-top:-41.7pt;width:40.85pt;height:71.3pt;z-index:1;visibility:visible;mso-wrap-edited:f;mso-width-percent:0;mso-height-percent:0;mso-width-percent:0;mso-height-percent:0">
             <v:imagedata r:id="rId7" o:title="logo_big"/>
+            <w10:wrap type="square"/>
           </v:shape>
         </w:pict>
-      </w:r>
-      <w:r>
-        <w:rPr>
-          <w:rFonts w:ascii="TH Sarabun New" w:hAnsi="TH Sarabun New" w:cs="TH Sarabun New"/>
-          <w:sz w:val="32"/>
-          <w:szCs w:val="32"/>
-        </w:rPr>
-        <w:t xml:space="preserve">        </w:t>
-      </w:r>
-      <w:r>
-        <w:rPr>
-          <w:rFonts w:ascii="TH Sarabun New" w:hAnsi="TH Sarabun New" w:cs="TH Sarabun New"/>
-          <w:sz w:val="32"/>
-          <w:szCs w:val="32"/>
-        </w:rPr>
-        <w:tab/>
-      </w:r>
-      <w:r>
-        <w:rPr>
-          <w:rFonts w:ascii="TH Sarabun New" w:hAnsi="TH Sarabun New" w:cs="TH Sarabun New"/>
-          <w:sz w:val="48"/>
-          <w:szCs w:val="48"/>
-        </w:rPr>
-        <w:t xml:space="preserve">   </w:t>
-      </w:r>
-      <w:r>
-        <w:rPr>
-          <w:rFonts w:ascii="TH Sarabun New" w:hAnsi="TH Sarabun New" w:cs="TH Sarabun New"/>
-          <w:b/>
-          <w:bCs/>
-          <w:sz w:val="48"/>
-          <w:szCs w:val="48"/>
-        </w:rPr>
-        <w:t xml:space="preserve">              </w:t>
-      </w:r>
-      <w:r>
-        <w:rPr>
-          <w:rFonts w:ascii="TH Sarabun New" w:hAnsi="TH Sarabun New" w:cs="TH Sarabun New"/>
-          <w:b/>
-          <w:bCs/>
-          <w:sz w:val="48"/>
-          <w:szCs w:val="48"/>
-          <w:cs/>
-        </w:rPr>
-        <w:t xml:space="preserve">     </w:t>
-      </w:r>
-      <w:r>
-        <w:rPr>
-          <w:rFonts w:ascii="TH Sarabun New" w:hAnsi="TH Sarabun New" w:cs="TH Sarabun New"/>
-          <w:b/>
-          <w:bCs/>
-          <w:sz w:val="48"/>
-          <w:szCs w:val="48"/>
-        </w:rPr>
-        <w:t xml:space="preserve"> </w:t>
       </w:r>
       <w:r>
         <w:rPr>
@@ -922,6 +868,44 @@
       <w:pPr>
         <w:pStyle w:val="BodyText"/>
         <w:ind w:left="1275"/>
+        <w:rPr>
+          <w:rFonts w:ascii="TH Sarabun New" w:hAnsi="TH Sarabun New" w:cs="TH Sarabun New"/>
+        </w:rPr>
+      </w:pPr>
+      <w:r>
+        <w:rPr>
+          <w:rFonts w:ascii="TH Sarabun New" w:hAnsi="TH Sarabun New" w:cs="TH Sarabun New"/>
+        </w:rPr>
+        <w:t>{{index</w:t>
+      </w:r>
+      <w:r>
+        <w:rPr>
+          <w:rFonts w:ascii="TH Sarabun New" w:hAnsi="TH Sarabun New" w:cs="TH Sarabun New"/>
+        </w:rPr>
+        <w:t>1</w:t>
+      </w:r>
+      <w:r>
+        <w:rPr>
+          <w:rFonts w:ascii="TH Sarabun New" w:hAnsi="TH Sarabun New" w:cs="TH Sarabun New"/>
+        </w:rPr>
+        <w:t>}}{{research_title</w:t>
+      </w:r>
+      <w:r>
+        <w:rPr>
+          <w:rFonts w:ascii="TH Sarabun New" w:hAnsi="TH Sarabun New" w:cs="TH Sarabun New"/>
+        </w:rPr>
+        <w:t>1</w:t>
+      </w:r>
+      <w:r>
+        <w:rPr>
+          <w:rFonts w:ascii="TH Sarabun New" w:hAnsi="TH Sarabun New" w:cs="TH Sarabun New"/>
+        </w:rPr>
+        <w:t>}}</w:t>
+      </w:r>
+    </w:p>
+    <w:p>
+      <w:pPr>
+        <w:pStyle w:val="BodyText"/>
         <w:jc w:val="thaiDistribute"/>
         <w:rPr>
           <w:rFonts w:ascii="TH Sarabun New" w:hAnsi="TH Sarabun New" w:cs="TH Sarabun New"/>
@@ -930,22 +914,6 @@
       <w:r>
         <w:rPr>
           <w:rFonts w:ascii="TH Sarabun New" w:hAnsi="TH Sarabun New" w:cs="TH Sarabun New"/>
-        </w:rPr>
-        <w:t>{{?academic_paper_list}}{{index}}. {{paper_title}} {{/academic_paper_list}}</w:t>
-      </w:r>
-    </w:p>
-    <w:p>
-      <w:pPr>
-        <w:pStyle w:val="BodyText"/>
-        <w:ind w:left="1275"/>
-        <w:jc w:val="thaiDistribute"/>
-        <w:rPr>
-          <w:rFonts w:ascii="TH Sarabun New" w:hAnsi="TH Sarabun New" w:cs="TH Sarabun New"/>
-        </w:rPr>
-      </w:pPr>
-      <w:r>
-        <w:rPr>
-          <w:rFonts w:ascii="TH Sarabun New" w:hAnsi="TH Sarabun New" w:cs="TH Sarabun New"/>
           <w:cs/>
         </w:rPr>
         <w:t xml:space="preserve">โดยข้าพเจ้าได้ทำการศึกษาวิจัยเพิ่มเติมในลักษณะดังนี้ </w:t>
@@ -969,32 +937,6 @@
         </w:rPr>
         <w:t>)</w:t>
       </w:r>
-    </w:p>
-    <w:p>
-      <w:pPr>
-        <w:pStyle w:val="BodyText"/>
-        <w:ind w:left="1275"/>
-        <w:jc w:val="thaiDistribute"/>
-        <w:rPr>
-          <w:rFonts w:ascii="TH Sarabun New" w:hAnsi="TH Sarabun New" w:cs="TH Sarabun New"/>
-        </w:rPr>
-      </w:pPr>
-      <w:r>
-        <w:rPr>
-          <w:rFonts w:ascii="TH Sarabun New" w:hAnsi="TH Sarabun New" w:cs="TH Sarabun New"/>
-        </w:rPr>
-        <w:t>{{academic_paper_additional_detail}}</w:t>
-      </w:r>
-    </w:p>
-    <w:p>
-      <w:pPr>
-        <w:pStyle w:val="BodyText"/>
-        <w:ind w:left="360"/>
-        <w:jc w:val="thaiDistribute"/>
-        <w:rPr>
-          <w:rFonts w:ascii="TH Sarabun New" w:hAnsi="TH Sarabun New" w:cs="TH Sarabun New"/>
-        </w:rPr>
-      </w:pPr>
     </w:p>
     <w:p>
       <w:pPr>
@@ -1142,7 +1084,13 @@
         <w:rPr>
           <w:rFonts w:ascii="TH Sarabun New" w:hAnsi="TH Sarabun New" w:cs="TH Sarabun New"/>
         </w:rPr>
-        <w:t>{{?research_list}}{{index}}. {{research_title}}{{/research_list}}</w:t>
+        <w:t>{{index}}{{research_title}</w:t>
+      </w:r>
+      <w:r>
+        <w:rPr>
+          <w:rFonts w:ascii="TH Sarabun New" w:hAnsi="TH Sarabun New" w:cs="TH Sarabun New"/>
+        </w:rPr>
+        <w:t>}</w:t>
       </w:r>
     </w:p>
     <w:p>
@@ -1206,9 +1154,10 @@
     <w:p>
       <w:pPr>
         <w:pStyle w:val="BodyText"/>
-        <w:jc w:val="center"/>
-        <w:rPr>
-          <w:rFonts w:ascii="TH Sarabun New" w:hAnsi="TH Sarabun New" w:cs="TH Sarabun New"/>
+        <w:ind w:left="360" w:firstLine="360"/>
+        <w:jc w:val="thaiDistribute"/>
+        <w:rPr>
+          <w:rFonts w:ascii="TH Sarabun New" w:hAnsi="TH Sarabun New" w:cs="TH Sarabun New" w:hint="cs"/>
         </w:rPr>
       </w:pPr>
     </w:p>
@@ -1292,7 +1241,6 @@
         <w:rPr>
           <w:rFonts w:ascii="TH Sarabun New" w:hAnsi="TH Sarabun New" w:cs="TH Sarabun New"/>
         </w:rPr>
-        <w:lastRenderedPageBreak/>
         <w:t>(</w:t>
       </w:r>
       <w:r>
@@ -1327,7 +1275,7 @@
         <w:pStyle w:val="BodyText"/>
         <w:jc w:val="center"/>
         <w:rPr>
-          <w:rFonts w:ascii="TH Sarabun New" w:hAnsi="TH Sarabun New" w:cs="TH Sarabun New"/>
+          <w:rFonts w:ascii="TH Sarabun New" w:hAnsi="TH Sarabun New" w:cs="TH Sarabun New" w:hint="cs"/>
         </w:rPr>
       </w:pPr>
       <w:r>
@@ -1348,25 +1296,6 @@
         </w:rPr>
         <w:t>)</w:t>
       </w:r>
-    </w:p>
-    <w:p>
-      <w:pPr>
-        <w:pStyle w:val="BodyText"/>
-        <w:ind w:left="3600" w:firstLine="720"/>
-        <w:jc w:val="thaiDistribute"/>
-        <w:rPr>
-          <w:rFonts w:ascii="TH Sarabun New" w:hAnsi="TH Sarabun New" w:cs="TH Sarabun New"/>
-        </w:rPr>
-      </w:pPr>
-    </w:p>
-    <w:p>
-      <w:pPr>
-        <w:pStyle w:val="BodyText"/>
-        <w:jc w:val="thaiDistribute"/>
-        <w:rPr>
-          <w:rFonts w:ascii="TH Sarabun New" w:hAnsi="TH Sarabun New" w:cs="TH Sarabun New"/>
-        </w:rPr>
-      </w:pPr>
     </w:p>
     <w:sectPr>
       <w:pgSz w:w="11906" w:h="16838"/>
@@ -1937,7 +1866,6 @@
   <w:style w:type="character" w:default="1" w:styleId="DefaultParagraphFont">
     <w:name w:val="Default Paragraph Font"/>
     <w:uiPriority w:val="1"/>
-    <w:semiHidden/>
     <w:unhideWhenUsed/>
   </w:style>
   <w:style w:type="table" w:default="1" w:styleId="TableNormal">

</xml_diff>

<commit_message>
Use template positioning for paper/research lists
Update DocumentGenerationService to preserve the template's own positioning for the first paper/research item and append subsequent items with line breaks. Instead of building a combined list and clearing the template index, the code now reads the first placeholder (paper_title_1 / research_title_1), uses it as the primary entry, appends items 2..N prefixed with their numeric index, and sets the template index placeholders (index1 / index) to "1. ". Also includes an updated p2doc_4.docx template to match these placeholder/format changes.
</commit_message>
<xml_diff>
--- a/HRCP-KKU-Academic/src/main/resources/templates/docx/Phase2/p2doc_4.docx
+++ b/HRCP-KKU-Academic/src/main/resources/templates/docx/Phase2/p2doc_4.docx
@@ -16,7 +16,7 @@
           <w:rFonts w:ascii="TH Sarabun New" w:hAnsi="TH Sarabun New" w:cs="TH Sarabun New"/>
           <w:noProof/>
         </w:rPr>
-        <w:pict w14:anchorId="14A834E3">
+        <w:pict w14:anchorId="4A9D8BE6">
           <v:shapetype id="_x0000_t75" coordsize="21600,21600" o:spt="75" o:preferrelative="t" path="m@4@5l@4@11@9@11@9@5xe" filled="f" stroked="f">
             <v:stroke joinstyle="miter"/>
             <v:formulas>
@@ -794,7 +794,6 @@
       <w:pPr>
         <w:pStyle w:val="BodyText"/>
         <w:ind w:left="360"/>
-        <w:jc w:val="thaiDistribute"/>
         <w:rPr>
           <w:rFonts w:ascii="TH Sarabun New" w:hAnsi="TH Sarabun New" w:cs="TH Sarabun New"/>
         </w:rPr>
@@ -861,13 +860,20 @@
           <w:rFonts w:ascii="TH Sarabun New" w:hAnsi="TH Sarabun New" w:cs="TH Sarabun New"/>
           <w:cs/>
         </w:rPr>
-        <w:t>เรื่อง  คือ</w:t>
+        <w:t xml:space="preserve">เรื่อง </w:t>
+      </w:r>
+      <w:r>
+        <w:rPr>
+          <w:rFonts w:ascii="TH Sarabun New" w:hAnsi="TH Sarabun New" w:cs="TH Sarabun New" w:hint="cs"/>
+          <w:cs/>
+        </w:rPr>
+        <w:t>คือ</w:t>
       </w:r>
     </w:p>
     <w:p>
       <w:pPr>
         <w:pStyle w:val="BodyText"/>
-        <w:ind w:left="1275"/>
+        <w:ind w:left="360"/>
         <w:rPr>
           <w:rFonts w:ascii="TH Sarabun New" w:hAnsi="TH Sarabun New" w:cs="TH Sarabun New"/>
         </w:rPr>
@@ -1074,7 +1080,7 @@
     <w:p>
       <w:pPr>
         <w:pStyle w:val="BodyText"/>
-        <w:ind w:left="915"/>
+        <w:ind w:left="360"/>
         <w:jc w:val="thaiDistribute"/>
         <w:rPr>
           <w:rFonts w:ascii="TH Sarabun New" w:hAnsi="TH Sarabun New" w:cs="TH Sarabun New"/>

</xml_diff>